<commit_message>
docs: remove Biznes role from role presentation (no frontend, not deployed)
Co-Authored-By: Claude Fable 5 <noreply@anthropic.com>
Claude-Session: https://claude.ai/code/session_0172x8qWMS1DstxvsiAqiHgm
</commit_message>
<xml_diff>
--- a/docs/Uchqun-loyiha-taqdimoti.docx
+++ b/docs/Uchqun-loyiha-taqdimoti.docx
@@ -157,7 +157,7 @@
                 <w:sz w:val="30"/>
                 <w:szCs w:val="30"/>
               </w:rPr>
-              <w:t xml:space="preserve">6</w:t>
+              <w:t xml:space="preserve">5</w:t>
             </w:r>
           </w:p>
           <w:p>
@@ -288,7 +288,7 @@
           <w:sz w:val="19"/>
           <w:szCs w:val="19"/>
         </w:rPr>
-        <w:t xml:space="preserve">Hukumat  ›  Biznes  ›  Administrator  ›  Qabulxona  ›  Tarbiyachi  ›  Ota-ona</w:t>
+        <w:t xml:space="preserve">Hukumat  ›  Administrator  ›  Qabulxona  ›  Tarbiyachi  ›  Ota-ona</w:t>
       </w:r>
     </w:p>
     <w:p>
@@ -450,6 +450,9 @@
         </w:tc>
       </w:tr>
       <w:tr>
+        <w:trPr>
+          <w:cantSplit/>
+        </w:trPr>
         <w:tc>
           <w:tcPr>
             <w:tcW w:type="dxa" w:w="1750"/>
@@ -569,6 +572,9 @@
         </w:tc>
       </w:tr>
       <w:tr>
+        <w:trPr>
+          <w:cantSplit/>
+        </w:trPr>
         <w:tc>
           <w:tcPr>
             <w:tcW w:type="dxa" w:w="1750"/>
@@ -594,7 +600,7 @@
                 <w:sz w:val="18"/>
                 <w:szCs w:val="18"/>
               </w:rPr>
-              <w:t xml:space="preserve">Biznes</w:t>
+              <w:t xml:space="preserve">Administrator</w:t>
             </w:r>
           </w:p>
         </w:tc>
@@ -622,7 +628,7 @@
                 <w:sz w:val="18"/>
                 <w:szCs w:val="18"/>
               </w:rPr>
-              <w:t xml:space="preserve">Homiy va investor tashkilotlar</w:t>
+              <w:t xml:space="preserve">Maktab direktori yoki bosh administrator</w:t>
             </w:r>
           </w:p>
         </w:tc>
@@ -650,7 +656,7 @@
                 <w:sz w:val="18"/>
                 <w:szCs w:val="18"/>
               </w:rPr>
-              <w:t xml:space="preserve">Butun platforma (faqat umumlashtirilgan koʻrsatkichlar)</w:t>
+              <w:t xml:space="preserve">Bitta maktab</w:t>
             </w:r>
           </w:p>
         </w:tc>
@@ -678,12 +684,15 @@
                 <w:sz w:val="18"/>
                 <w:szCs w:val="18"/>
               </w:rPr>
-              <w:t xml:space="preserve">Statistikani kuzatish va davriy hisobotlar shakllantirish; toʻliq «faqat oʻqish» rejimi</w:t>
+              <w:t xml:space="preserve">Kundalik maʼmuriy boshqaruv: xodimlar va ota-onalar hisoblari, hujjatlarni tasdiqlash, ommaviy import, ichki nazorat</w:t>
             </w:r>
           </w:p>
         </w:tc>
       </w:tr>
       <w:tr>
+        <w:trPr>
+          <w:cantSplit/>
+        </w:trPr>
         <w:tc>
           <w:tcPr>
             <w:tcW w:type="dxa" w:w="1750"/>
@@ -710,7 +719,7 @@
                 <w:sz w:val="18"/>
                 <w:szCs w:val="18"/>
               </w:rPr>
-              <w:t xml:space="preserve">Administrator</w:t>
+              <w:t xml:space="preserve">Qabulxona</w:t>
             </w:r>
           </w:p>
         </w:tc>
@@ -739,7 +748,7 @@
                 <w:sz w:val="18"/>
                 <w:szCs w:val="18"/>
               </w:rPr>
-              <w:t xml:space="preserve">Maktab direktori yoki bosh administrator</w:t>
+              <w:t xml:space="preserve">Kotib va maʼmuriy xodimlar</w:t>
             </w:r>
           </w:p>
         </w:tc>
@@ -797,12 +806,15 @@
                 <w:sz w:val="18"/>
                 <w:szCs w:val="18"/>
               </w:rPr>
-              <w:t xml:space="preserve">Kundalik maʼmuriy boshqaruv: xodimlar va ota-onalar hisoblari, hujjatlarni tasdiqlash, ommaviy import, ichki nazorat</w:t>
+              <w:t xml:space="preserve">Oilalarni roʻyxatga olish, oʻqituvchilarni ishga qabul qilish, guruhlarni tashkil etish, rasmiy hujjatlar bilan ishlash</w:t>
             </w:r>
           </w:p>
         </w:tc>
       </w:tr>
       <w:tr>
+        <w:trPr>
+          <w:cantSplit/>
+        </w:trPr>
         <w:tc>
           <w:tcPr>
             <w:tcW w:type="dxa" w:w="1750"/>
@@ -828,7 +840,7 @@
                 <w:sz w:val="18"/>
                 <w:szCs w:val="18"/>
               </w:rPr>
-              <w:t xml:space="preserve">Qabulxona</w:t>
+              <w:t xml:space="preserve">Tarbiyachi</w:t>
             </w:r>
           </w:p>
         </w:tc>
@@ -856,7 +868,7 @@
                 <w:sz w:val="18"/>
                 <w:szCs w:val="18"/>
               </w:rPr>
-              <w:t xml:space="preserve">Kotib va maʼmuriy xodimlar</w:t>
+              <w:t xml:space="preserve">Maxsus taʼlim pedagoglari, guruh rahbarlari</w:t>
             </w:r>
           </w:p>
         </w:tc>
@@ -884,7 +896,7 @@
                 <w:sz w:val="18"/>
                 <w:szCs w:val="18"/>
               </w:rPr>
-              <w:t xml:space="preserve">Bitta maktab</w:t>
+              <w:t xml:space="preserve">Oʻz guruhi</w:t>
             </w:r>
           </w:p>
         </w:tc>
@@ -912,12 +924,15 @@
                 <w:sz w:val="18"/>
                 <w:szCs w:val="18"/>
               </w:rPr>
-              <w:t xml:space="preserve">Oilalarni roʻyxatga olish, oʻqituvchilarni ishga qabul qilish, guruhlarni tashkil etish, rasmiy hujjatlar bilan ishlash</w:t>
+              <w:t xml:space="preserve">Pedagogik jarayon: individual rivojlanish rejasi (IRR), baholash, davomat, kundalik jurnallar, ota-onalar bilan aloqa</w:t>
             </w:r>
           </w:p>
         </w:tc>
       </w:tr>
       <w:tr>
+        <w:trPr>
+          <w:cantSplit/>
+        </w:trPr>
         <w:tc>
           <w:tcPr>
             <w:tcW w:type="dxa" w:w="1750"/>
@@ -944,7 +959,7 @@
                 <w:sz w:val="18"/>
                 <w:szCs w:val="18"/>
               </w:rPr>
-              <w:t xml:space="preserve">Tarbiyachi</w:t>
+              <w:t xml:space="preserve">Ota-ona</w:t>
             </w:r>
           </w:p>
         </w:tc>
@@ -973,7 +988,7 @@
                 <w:sz w:val="18"/>
                 <w:szCs w:val="18"/>
               </w:rPr>
-              <w:t xml:space="preserve">Maxsus taʼlim pedagoglari, guruh rahbarlari</w:t>
+              <w:t xml:space="preserve">Ota-onalar va vasiylar</w:t>
             </w:r>
           </w:p>
         </w:tc>
@@ -1002,7 +1017,7 @@
                 <w:sz w:val="18"/>
                 <w:szCs w:val="18"/>
               </w:rPr>
-              <w:t xml:space="preserve">Oʻz guruhi</w:t>
+              <w:t xml:space="preserve">Faqat oʻz farzandi</w:t>
             </w:r>
           </w:p>
         </w:tc>
@@ -1016,121 +1031,6 @@
               <w:right w:val="single" w:color="D9D9D9" w:sz="4"/>
             </w:tcBorders>
             <w:shd w:fill="EDF2F9" w:val="clear"/>
-            <w:tcMar>
-              <w:top w:type="dxa" w:w="50"/>
-              <w:left w:type="dxa" w:w="100"/>
-              <w:bottom w:type="dxa" w:w="50"/>
-              <w:right w:type="dxa" w:w="100"/>
-            </w:tcMar>
-          </w:tcPr>
-          <w:p>
-            <w:r>
-              <w:rPr>
-                <w:b w:val="false"/>
-                <w:bCs w:val="false"/>
-                <w:sz w:val="18"/>
-                <w:szCs w:val="18"/>
-              </w:rPr>
-              <w:t xml:space="preserve">Pedagogik jarayon: individual rivojlanish rejasi (IRR), baholash, davomat, kundalik jurnallar, ota-onalar bilan aloqa</w:t>
-            </w:r>
-          </w:p>
-        </w:tc>
-      </w:tr>
-      <w:tr>
-        <w:tc>
-          <w:tcPr>
-            <w:tcW w:type="dxa" w:w="1750"/>
-            <w:tcBorders>
-              <w:top w:val="single" w:color="D9D9D9" w:sz="4"/>
-              <w:left w:val="single" w:color="D9D9D9" w:sz="4"/>
-              <w:bottom w:val="single" w:color="D9D9D9" w:sz="4"/>
-              <w:right w:val="single" w:color="D9D9D9" w:sz="4"/>
-            </w:tcBorders>
-            <w:tcMar>
-              <w:top w:type="dxa" w:w="50"/>
-              <w:left w:type="dxa" w:w="100"/>
-              <w:bottom w:type="dxa" w:w="50"/>
-              <w:right w:type="dxa" w:w="100"/>
-            </w:tcMar>
-          </w:tcPr>
-          <w:p>
-            <w:r>
-              <w:rPr>
-                <w:b/>
-                <w:bCs/>
-                <w:color w:val="1F3864"/>
-                <w:sz w:val="18"/>
-                <w:szCs w:val="18"/>
-              </w:rPr>
-              <w:t xml:space="preserve">Ota-ona</w:t>
-            </w:r>
-          </w:p>
-        </w:tc>
-        <w:tc>
-          <w:tcPr>
-            <w:tcW w:type="dxa" w:w="2250"/>
-            <w:tcBorders>
-              <w:top w:val="single" w:color="D9D9D9" w:sz="4"/>
-              <w:left w:val="single" w:color="D9D9D9" w:sz="4"/>
-              <w:bottom w:val="single" w:color="D9D9D9" w:sz="4"/>
-              <w:right w:val="single" w:color="D9D9D9" w:sz="4"/>
-            </w:tcBorders>
-            <w:tcMar>
-              <w:top w:type="dxa" w:w="50"/>
-              <w:left w:type="dxa" w:w="100"/>
-              <w:bottom w:type="dxa" w:w="50"/>
-              <w:right w:type="dxa" w:w="100"/>
-            </w:tcMar>
-          </w:tcPr>
-          <w:p>
-            <w:r>
-              <w:rPr>
-                <w:b w:val="false"/>
-                <w:bCs w:val="false"/>
-                <w:sz w:val="18"/>
-                <w:szCs w:val="18"/>
-              </w:rPr>
-              <w:t xml:space="preserve">Ota-onalar va vasiylar</w:t>
-            </w:r>
-          </w:p>
-        </w:tc>
-        <w:tc>
-          <w:tcPr>
-            <w:tcW w:type="dxa" w:w="2000"/>
-            <w:tcBorders>
-              <w:top w:val="single" w:color="D9D9D9" w:sz="4"/>
-              <w:left w:val="single" w:color="D9D9D9" w:sz="4"/>
-              <w:bottom w:val="single" w:color="D9D9D9" w:sz="4"/>
-              <w:right w:val="single" w:color="D9D9D9" w:sz="4"/>
-            </w:tcBorders>
-            <w:tcMar>
-              <w:top w:type="dxa" w:w="50"/>
-              <w:left w:type="dxa" w:w="100"/>
-              <w:bottom w:type="dxa" w:w="50"/>
-              <w:right w:type="dxa" w:w="100"/>
-            </w:tcMar>
-          </w:tcPr>
-          <w:p>
-            <w:r>
-              <w:rPr>
-                <w:b w:val="false"/>
-                <w:bCs w:val="false"/>
-                <w:sz w:val="18"/>
-                <w:szCs w:val="18"/>
-              </w:rPr>
-              <w:t xml:space="preserve">Faqat oʻz farzandi</w:t>
-            </w:r>
-          </w:p>
-        </w:tc>
-        <w:tc>
-          <w:tcPr>
-            <w:tcW w:type="dxa" w:w="4200"/>
-            <w:tcBorders>
-              <w:top w:val="single" w:color="D9D9D9" w:sz="4"/>
-              <w:left w:val="single" w:color="D9D9D9" w:sz="4"/>
-              <w:bottom w:val="single" w:color="D9D9D9" w:sz="4"/>
-              <w:right w:val="single" w:color="D9D9D9" w:sz="4"/>
-            </w:tcBorders>
             <w:tcMar>
               <w:top w:type="dxa" w:w="50"/>
               <w:left w:type="dxa" w:w="100"/>
@@ -1249,6 +1149,9 @@
         </w:tc>
       </w:tr>
       <w:tr>
+        <w:trPr>
+          <w:cantSplit/>
+        </w:trPr>
         <w:tc>
           <w:tcPr>
             <w:tcW w:type="dxa" w:w="1750"/>
@@ -1310,6 +1213,9 @@
         </w:tc>
       </w:tr>
       <w:tr>
+        <w:trPr>
+          <w:cantSplit/>
+        </w:trPr>
         <w:tc>
           <w:tcPr>
             <w:tcW w:type="dxa" w:w="1750"/>
@@ -1335,7 +1241,7 @@
                 <w:sz w:val="18"/>
                 <w:szCs w:val="18"/>
               </w:rPr>
-              <w:t xml:space="preserve">Biznes</w:t>
+              <w:t xml:space="preserve">Administrator</w:t>
             </w:r>
           </w:p>
         </w:tc>
@@ -1363,12 +1269,15 @@
                 <w:sz w:val="18"/>
                 <w:szCs w:val="18"/>
               </w:rPr>
-              <w:t xml:space="preserve">Foydalanuvchilar, maktablar va terapiya vositalari boʻyicha umumiy statistika · sana va rol boʻyicha filtrlash · nomlangan davriy hisobotlar (kunlikdan yillikgacha)</w:t>
+              <w:t xml:space="preserve">Real vaqtdagi boshqaruv paneli · qabulxona va ota-onalar hisoblarini boshqarish · hujjatlarni tasdiqlash navbati · CSV orqali ommaviy import (oldindan tekshiruv bilan) · IRR monitoringini tasdiqlash · yozishmalar nazorati · savat orqali tiklash · hukumat bilan rasmiy yozishma</w:t>
             </w:r>
           </w:p>
         </w:tc>
       </w:tr>
       <w:tr>
+        <w:trPr>
+          <w:cantSplit/>
+        </w:trPr>
         <w:tc>
           <w:tcPr>
             <w:tcW w:type="dxa" w:w="1750"/>
@@ -1395,7 +1304,7 @@
                 <w:sz w:val="18"/>
                 <w:szCs w:val="18"/>
               </w:rPr>
-              <w:t xml:space="preserve">Administrator</w:t>
+              <w:t xml:space="preserve">Qabulxona</w:t>
             </w:r>
           </w:p>
         </w:tc>
@@ -1424,12 +1333,15 @@
                 <w:sz w:val="18"/>
                 <w:szCs w:val="18"/>
               </w:rPr>
-              <w:t xml:space="preserve">Real vaqtdagi boshqaruv paneli · qabulxona va ota-onalar hisoblarini boshqarish · hujjatlarni tasdiqlash navbati · CSV orqali ommaviy import (oldindan tekshiruv bilan) · IRR monitoringini tasdiqlash · yozishmalar nazorati · savat orqali tiklash · hukumat bilan rasmiy yozishma</w:t>
+              <w:t xml:space="preserve">3 bosqichli oila roʻyxatga olish · bolalar va ota-onalar reyestri · parolni bir zumda tiklash · oʻqituvchilarni boshqarish · guruhlar (sigʻim, yosh, masʼul oʻqituvchi) · maktab hujjatlarini yuklash · ommaviy amallar va CSV eksport</w:t>
             </w:r>
           </w:p>
         </w:tc>
       </w:tr>
       <w:tr>
+        <w:trPr>
+          <w:cantSplit/>
+        </w:trPr>
         <w:tc>
           <w:tcPr>
             <w:tcW w:type="dxa" w:w="1750"/>
@@ -1455,7 +1367,7 @@
                 <w:sz w:val="18"/>
                 <w:szCs w:val="18"/>
               </w:rPr>
-              <w:t xml:space="preserve">Qabulxona</w:t>
+              <w:t xml:space="preserve">Tarbiyachi</w:t>
             </w:r>
           </w:p>
         </w:tc>
@@ -1483,12 +1395,15 @@
                 <w:sz w:val="18"/>
                 <w:szCs w:val="18"/>
               </w:rPr>
-              <w:t xml:space="preserve">3 bosqichli oila roʻyxatga olish · bolalar va ota-onalar reyestri · parolni bir zumda tiklash · oʻqituvchilarni boshqarish · guruhlar (sigʻim, yosh, masʼul oʻqituvchi) · maktab hujjatlarini yuklash · ommaviy amallar va CSV eksport</w:t>
+              <w:t xml:space="preserve">IRR yaratish va yuritish · 17 mezonli rivojlanish baholash · uzoq va qisqa muddatli maqsadlar · kundalik (27 band) va haftalik (18 band) jurnallar · davomat · emotsional monitoring · ota-onalar bilan real vaqtdagi chat · foto/video galereya · ovqatlanish jurnali · terapiya seanslari</w:t>
             </w:r>
           </w:p>
         </w:tc>
       </w:tr>
       <w:tr>
+        <w:trPr>
+          <w:cantSplit/>
+        </w:trPr>
         <w:tc>
           <w:tcPr>
             <w:tcW w:type="dxa" w:w="1750"/>
@@ -1515,7 +1430,7 @@
                 <w:sz w:val="18"/>
                 <w:szCs w:val="18"/>
               </w:rPr>
-              <w:t xml:space="preserve">Tarbiyachi</w:t>
+              <w:t xml:space="preserve">Ota-ona</w:t>
             </w:r>
           </w:p>
         </w:tc>
@@ -1529,65 +1444,6 @@
               <w:right w:val="single" w:color="D9D9D9" w:sz="4"/>
             </w:tcBorders>
             <w:shd w:fill="EDF2F9" w:val="clear"/>
-            <w:tcMar>
-              <w:top w:type="dxa" w:w="50"/>
-              <w:left w:type="dxa" w:w="100"/>
-              <w:bottom w:type="dxa" w:w="50"/>
-              <w:right w:type="dxa" w:w="100"/>
-            </w:tcMar>
-          </w:tcPr>
-          <w:p>
-            <w:r>
-              <w:rPr>
-                <w:b w:val="false"/>
-                <w:bCs w:val="false"/>
-                <w:sz w:val="18"/>
-                <w:szCs w:val="18"/>
-              </w:rPr>
-              <w:t xml:space="preserve">IRR yaratish va yuritish · 17 mezonli rivojlanish baholash · uzoq va qisqa muddatli maqsadlar · kundalik (27 band) va haftalik (18 band) jurnallar · davomat · emotsional monitoring · ota-onalar bilan real vaqtdagi chat · foto/video galereya · ovqatlanish jurnali · terapiya seanslari</w:t>
-            </w:r>
-          </w:p>
-        </w:tc>
-      </w:tr>
-      <w:tr>
-        <w:tc>
-          <w:tcPr>
-            <w:tcW w:type="dxa" w:w="1750"/>
-            <w:tcBorders>
-              <w:top w:val="single" w:color="D9D9D9" w:sz="4"/>
-              <w:left w:val="single" w:color="D9D9D9" w:sz="4"/>
-              <w:bottom w:val="single" w:color="D9D9D9" w:sz="4"/>
-              <w:right w:val="single" w:color="D9D9D9" w:sz="4"/>
-            </w:tcBorders>
-            <w:tcMar>
-              <w:top w:type="dxa" w:w="50"/>
-              <w:left w:type="dxa" w:w="100"/>
-              <w:bottom w:type="dxa" w:w="50"/>
-              <w:right w:type="dxa" w:w="100"/>
-            </w:tcMar>
-          </w:tcPr>
-          <w:p>
-            <w:r>
-              <w:rPr>
-                <w:b/>
-                <w:bCs/>
-                <w:color w:val="1F3864"/>
-                <w:sz w:val="18"/>
-                <w:szCs w:val="18"/>
-              </w:rPr>
-              <w:t xml:space="preserve">Ota-ona</w:t>
-            </w:r>
-          </w:p>
-        </w:tc>
-        <w:tc>
-          <w:tcPr>
-            <w:tcW w:type="dxa" w:w="8450"/>
-            <w:tcBorders>
-              <w:top w:val="single" w:color="D9D9D9" w:sz="4"/>
-              <w:left w:val="single" w:color="D9D9D9" w:sz="4"/>
-              <w:bottom w:val="single" w:color="D9D9D9" w:sz="4"/>
-              <w:right w:val="single" w:color="D9D9D9" w:sz="4"/>
-            </w:tcBorders>
             <w:tcMar>
               <w:top w:type="dxa" w:w="50"/>
               <w:left w:type="dxa" w:w="100"/>

</xml_diff>